<commit_message>
Deploying to gh-pages from @ Morrison-Lab/psc@fd1ea0079d77855e6a6ec76b5b3c369bfbdf3658 🚀
</commit_message>
<xml_diff>
--- a/chapters/code-publication.docx
+++ b/chapters/code-publication.docx
@@ -15,7 +15,7 @@
         <w:pStyle w:val="Date"/>
       </w:pPr>
       <w:r>
-        <w:t xml:space="preserve">Last modified: 2026-10-14 04:06:05 (PDT)</w:t>
+        <w:t xml:space="preserve">Last modified: 2026-10-14 04:15:39 (PDT)</w:t>
       </w:r>
     </w:p>
     <w:bookmarkStart w:id="9" w:name="sec-checklist-overview"/>
@@ -910,7 +910,7 @@
         <w:t xml:space="preserve"> </w:t>
       </w:r>
       <w:r>
-        <w:t xml:space="preserve">and adds lab-specific guidance on versioning and tagging.</w:t>
+        <w:t xml:space="preserve">and adds guidance on versioning and tagging.</w:t>
       </w:r>
       <w:r>
         <w:t xml:space="preserve"> </w:t>

</xml_diff>